<commit_message>
Documento de Software - Atualização
</commit_message>
<xml_diff>
--- a/Diagramas/DicionarioTermosTecnicos/dicionariotermosTecnicos.docx
+++ b/Diagramas/DicionarioTermosTecnicos/dicionariotermosTecnicos.docx
@@ -9,6 +9,7 @@
           <w:rFonts w:ascii="Arial Black" w:hAnsi="Arial Black" w:cstheme="minorHAnsi"/>
           <w:b/>
           <w:bCs/>
+          <w:i/>
           <w:sz w:val="44"/>
           <w:szCs w:val="44"/>
         </w:rPr>
@@ -21,6 +22,7 @@
           <w:rFonts w:ascii="Arial Black" w:hAnsi="Arial Black" w:cstheme="minorHAnsi"/>
           <w:b/>
           <w:bCs/>
+          <w:i/>
           <w:sz w:val="36"/>
           <w:szCs w:val="36"/>
         </w:rPr>
@@ -33,6 +35,7 @@
           <w:rFonts w:ascii="Arial Black" w:hAnsi="Arial Black" w:cstheme="minorHAnsi"/>
           <w:b/>
           <w:bCs/>
+          <w:i/>
           <w:sz w:val="36"/>
           <w:szCs w:val="36"/>
         </w:rPr>
@@ -45,10 +48,12 @@
           <w:rFonts w:ascii="Arial Black" w:hAnsi="Arial Black" w:cstheme="minorHAnsi"/>
           <w:b/>
           <w:bCs/>
+          <w:i/>
           <w:sz w:val="36"/>
           <w:szCs w:val="36"/>
         </w:rPr>
       </w:pPr>
+      <w:bookmarkStart w:id="0" w:name="_GoBack"/>
     </w:p>
     <w:p>
       <w:pPr>
@@ -211,15 +216,13 @@
           <w:sz w:val="32"/>
           <w:szCs w:val="32"/>
         </w:rPr>
-        <w:t>IV</w:t>
+        <w:t>V</w:t>
       </w:r>
     </w:p>
     <w:p>
       <w:r>
         <w:br w:type="page"/>
       </w:r>
-      <w:bookmarkStart w:id="0" w:name="_GoBack"/>
-      <w:bookmarkEnd w:id="0"/>
     </w:p>
     <w:tbl>
       <w:tblPr>
@@ -16097,6 +16100,7 @@
     <w:p/>
     <w:p/>
     <w:p/>
+    <w:bookmarkEnd w:id="0"/>
     <w:p/>
     <w:sectPr>
       <w:footerReference w:type="default" r:id="rId7"/>
@@ -16144,7 +16148,6 @@
         <w:docPartUnique/>
       </w:docPartObj>
     </w:sdtPr>
-    <w:sdtEndPr/>
     <w:sdtContent>
       <w:p>
         <w:pPr>
@@ -16164,7 +16167,7 @@
           <w:rPr>
             <w:noProof/>
           </w:rPr>
-          <w:t>9</w:t>
+          <w:t>13</w:t>
         </w:r>
         <w:r>
           <w:fldChar w:fldCharType="end"/>
@@ -17022,7 +17025,7 @@
   <a:extraClrSchemeLst/>
   <a:extLst>
     <a:ext uri="{05A4C25C-085E-4340-85A3-A5531E510DB2}">
-      <thm15:themeFamily xmlns:thm15="http://schemas.microsoft.com/office/thememl/2012/main" xmlns="" name="Office Theme" id="{62F939B6-93AF-4DB8-9C6B-D6C7DFDC589F}" vid="{4A3C46E8-61CC-4603-A589-7422A47A8E4A}"/>
+      <thm15:themeFamily xmlns="" xmlns:thm15="http://schemas.microsoft.com/office/thememl/2012/main" name="Office Theme" id="{62F939B6-93AF-4DB8-9C6B-D6C7DFDC589F}" vid="{4A3C46E8-61CC-4603-A589-7422A47A8E4A}"/>
     </a:ext>
   </a:extLst>
 </a:theme>

</xml_diff>